<commit_message>
docs: guía completa Estimación Rápida en manual v3 agosto 2026
Nuevas secciones insertadas en 'Página 8 — Presupuesto Bancable':
- Orden de ejecución obligatorio: tabla paso a paso
  Proyecto → Recurso Solar → Dimensionamiento → Estimación Rápida → Financiero → PDF
- Novedades agosto 2026:
  B1 Auto-actualización kWp (>5% dispara recálculo silencioso)
  B2 Modelo P90 zonal σ_irr+σ_PR (EPRI / IEC 61724-3)
  B3 Sección Estimación Rápida en Reporte PDF (nuevo checkbox)
  B4 Aviso proyectos BIPV <20 kWp (costos fijos dominan)
- Tabla de rangos USD/Wp corregida por tipo Y escala
- 6 errores frecuentes con causa y solución
- Interpretación de 6 indicadores clave (CAPEX, USD/Wp, OPEX, fracción equipos, escenario, P90)
- Sección ✅/⛔ cuándo usar vs cuándo no usar
- Sección 5c Reporte PDF mencionando el nuevo checkbox
- ToC actualizada con '+ 🧮 Estimación Rápida'
- Flujo de trabajo (sección 2) actualizado incluyendo Estimación Rápida
</commit_message>
<xml_diff>
--- a/attached_assets/MANUAL_CALCULADORA_BIPV_v3_agosto2026.docx
+++ b/attached_assets/MANUAL_CALCULADORA_BIPV_v3_agosto2026.docx
@@ -145,7 +145,7 @@
         <w:pStyle w:val="Listaconnmeros"/>
       </w:pPr>
       <w:r>
-        <w:t>Página 8 — Presupuesto Bancable  ACTUALIZADO</w:t>
+        <w:t>Página 8 — Presupuesto Bancable + 🧮 Estimación Rápida  ACTUALIZADO</w:t>
       </w:r>
     </w:p>
     <w:p>
@@ -337,6 +337,10 @@
           <w:sz w:val="17"/>
         </w:rPr>
         <w:t>1 Proyecto → 2 Recurso Solar → (3 Motor IV) → 4 Dimensionamiento</w:t>
+        <w:br/>
+        <w:t xml:space="preserve">    → (5b Motor Óptico) → 5 Mismatch/Bypass → 6 Producción</w:t>
+        <w:br/>
+        <w:t xml:space="preserve">    → 7 Financiero ← [🧮 Estimación Rápida en 8 Presupuesto] → 10 Reporte PDF</w:t>
       </w:r>
       <w:r>
         <w:rPr>
@@ -344,8 +348,6 @@
           <w:color w:val="1A5376"/>
           <w:sz w:val="17"/>
         </w:rPr>
-        <w:br/>
-        <w:t xml:space="preserve">    → (5b Motor Óptico) → 5 Mismatch/Bypass → 6 Producción</w:t>
       </w:r>
       <w:r>
         <w:rPr>
@@ -353,8 +355,6 @@
           <w:color w:val="1A5376"/>
           <w:sz w:val="17"/>
         </w:rPr>
-        <w:br/>
-        <w:t xml:space="preserve">    → [9 Vista 3D Multi-Sup ← opcional]</w:t>
       </w:r>
       <w:r>
         <w:rPr>
@@ -362,8 +362,6 @@
           <w:color w:val="1A5376"/>
           <w:sz w:val="17"/>
         </w:rPr>
-        <w:br/>
-        <w:t xml:space="preserve">    → 7 Financiero → 8 Presupuesto → 11 Baterías → 10 Reporte PDF</w:t>
       </w:r>
     </w:p>
     <w:p>
@@ -6398,6 +6396,684 @@
       </w:r>
     </w:p>
     <w:p>
+      <w:pPr/>
+      <w:r>
+        <w:t>────────────────────────────────────────────────────────────</w:t>
+      </w:r>
+    </w:p>
+    <w:p>
+      <w:pPr>
+        <w:pStyle w:val="Ttulo3"/>
+      </w:pPr>
+      <w:r>
+        <w:t>⚠️ Orden de ejecución obligatorio — Estimación Rápida</w:t>
+      </w:r>
+    </w:p>
+    <w:p>
+      <w:pPr/>
+      <w:r>
+        <w:t>La Estimación Rápida depende de los datos generados por tres páginas anteriores. Si se ejecuta sin ellas, usa valores por defecto que desconectan el presupuesto del proyecto real.</w:t>
+      </w:r>
+    </w:p>
+    <w:p>
+      <w:pPr/>
+      <w:r>
+        <w:t>────────────────────────────────────────────────────────────</w:t>
+      </w:r>
+    </w:p>
+    <w:p>
+      <w:pPr/>
+      <w:r>
+        <w:t xml:space="preserve">  Paso  │  Página  │  Qué aporta a la Estimación Rápida</w:t>
+      </w:r>
+    </w:p>
+    <w:p>
+      <w:pPr/>
+      <w:r>
+        <w:t xml:space="preserve">  1  │  🏗️ Proyecto  │  Ciudad → factor de zona geográfica (logística y clima). Si se omite, la zona queda en "Bogotá / Sabana" por defecto.</w:t>
+      </w:r>
+    </w:p>
+    <w:p>
+      <w:pPr/>
+      <w:r>
+        <w:t xml:space="preserve">  2  │  ☀️ Recurso Solar  │  TMY descargado → necesario para que Dimensionamiento calcule producción y kWp real.</w:t>
+      </w:r>
+    </w:p>
+    <w:p>
+      <w:pPr/>
+      <w:r>
+        <w:t xml:space="preserve">  3  │  📐 Dimensionamiento  │  kWp del sistema → la Estimación Rápida lo lee automáticamente. Sin esto usa 100 kWp de ejemplo.</w:t>
+      </w:r>
+    </w:p>
+    <w:p>
+      <w:pPr/>
+      <w:r>
+        <w:t xml:space="preserve">  4  │  🧮 Estimación Rápida  │  Configura tipo / escenario / zona → presiona ✅ Aplicar → CAPEX y OPEX quedan en sesión.</w:t>
+      </w:r>
+    </w:p>
+    <w:p>
+      <w:pPr/>
+      <w:r>
+        <w:t xml:space="preserve">  5  │  💰 Financiero  │  Lee CAPEX y OPEX de sesión automáticamente → TIR, VPN, Payback, P90 con datos reales.</w:t>
+      </w:r>
+    </w:p>
+    <w:p>
+      <w:pPr/>
+      <w:r>
+        <w:t xml:space="preserve">  6  │  📄 Reporte PDF  │  Activa checkbox "🧮 Incluir Estimación Rápida" → sección de prefactibilidad aparece en el PDF.</w:t>
+      </w:r>
+    </w:p>
+    <w:p>
+      <w:pPr/>
+      <w:r>
+        <w:t>⚠️ Regla crítica: si recargas el navegador, toda la sesión se pierde y debes ejecutar el flujo desde el Paso 1. La app no guarda proyectos entre sesiones.</w:t>
+      </w:r>
+    </w:p>
+    <w:p>
+      <w:pPr/>
+      <w:r>
+        <w:t>────────────────────────────────────────────────────────────</w:t>
+      </w:r>
+    </w:p>
+    <w:p>
+      <w:pPr>
+        <w:pStyle w:val="Ttulo3"/>
+      </w:pPr>
+      <w:r>
+        <w:t>🆕 Novedades agosto 2026 — Estimación Rápida</w:t>
+      </w:r>
+    </w:p>
+    <w:p>
+      <w:pPr/>
+      <w:r>
+        <w:t>B1 — Auto-actualización silenciosa del kWp</w:t>
+      </w:r>
+    </w:p>
+    <w:p>
+      <w:pPr/>
+      <w:r>
+        <w:t xml:space="preserve">    B1 — Auto-actualización silenciosa del kWp  (nuevo)</w:t>
+      </w:r>
+    </w:p>
+    <w:p>
+      <w:pPr/>
+      <w:r>
+        <w:rPr>
+          <w:b/>
+        </w:rPr>
+        <w:t>B1 — Auto-actualización silenciosa del kWp  (nuevo)</w:t>
+      </w:r>
+    </w:p>
+    <w:p>
+      <w:pPr/>
+      <w:r>
+        <w:t>Si después de aplicar la estimación vuelves a Dimensionamiento y cambias el layout (nuevos paneles, diferente tipo), la app detecta automáticamente que el kWp cambió. Si la diferencia supera el 5 %, recalcula y re-aplica con el mismo tipo / escenario / zona sin que tengas que hacer clic. Aparece un banner azul informativo:</w:t>
+        <w:br/>
+        <w:t xml:space="preserve">     🔄 Estimación Rápida auto-actualizada — el sistema cambió de X → Y kWp. CAPEX actualizado a USD Z. 💰 Financiero refleja el nuevo valor automáticamente.</w:t>
+      </w:r>
+    </w:p>
+    <w:p>
+      <w:pPr/>
+      <w:r/>
+    </w:p>
+    <w:p>
+      <w:pPr/>
+      <w:r>
+        <w:t xml:space="preserve">    B2 — Modelo P90 zonal basado en incertidumbre  (nuevo en Financiero)</w:t>
+      </w:r>
+    </w:p>
+    <w:p>
+      <w:pPr/>
+      <w:r>
+        <w:rPr>
+          <w:b/>
+        </w:rPr>
+        <w:t>B2 — Modelo P90 zonal basado en incertidumbre  (nuevo en Financiero)</w:t>
+      </w:r>
+    </w:p>
+    <w:p>
+      <w:pPr/>
+      <w:r>
+        <w:t>El factor P90 ya no es un slider genérico. Ahora se calcula automáticamente con dos fuentes:</w:t>
+        <w:br/>
+        <w:t xml:space="preserve">  • σ_irr — variabilidad interanual del TMY por zona: Urabá/Chocó 6.5 % · Bogotá/Llanos 5.5 % · Medellín 5.0 % · Cali 4.5 % · Costa Atlántica 4.0 %</w:t>
+        <w:br/>
+        <w:t xml:space="preserve">  • σ_PR  — incertidumbre del modelo de pérdidas: base 5.0 % → con Motor Óptico o Bypass 4.2 % → con ambos 3.5 % (máxima precisión)</w:t>
+        <w:br/>
+        <w:t xml:space="preserve">  • factor P90 = 1.28 × √(σ_irr² + σ_PR²)  — metodología EPRI TR-107348 / IEC 61724-3</w:t>
+        <w:br/>
+        <w:t>PVsyst usa un factor fijo manual sin diferenciación regional. Este modelo premia la profundidad de la simulación: activar Motor Óptico + Bypass reduce el factor P90 y mejora el flujo de caja proyectado. Existe un override manual opcional para expertos.</w:t>
+      </w:r>
+    </w:p>
+    <w:p>
+      <w:pPr/>
+      <w:r/>
+    </w:p>
+    <w:p>
+      <w:pPr/>
+      <w:r>
+        <w:t xml:space="preserve">    B3 — Sección Estimación Rápida en el Reporte PDF  (nuevo)</w:t>
+      </w:r>
+    </w:p>
+    <w:p>
+      <w:pPr/>
+      <w:r>
+        <w:rPr>
+          <w:b/>
+        </w:rPr>
+        <w:t>B3 — Sección Estimación Rápida en el Reporte PDF  (nuevo)</w:t>
+      </w:r>
+    </w:p>
+    <w:p>
+      <w:pPr/>
+      <w:r>
+        <w:t>El Reporte PDF incluye ahora un nuevo checkbox: "🧮 Incluir Estimación Rápida — Fundamentación del Presupuesto". Al activarlo aparece una sección completa con:</w:t>
+        <w:br/>
+        <w:t xml:space="preserve">  • Tabla de desglose CAPEX por 4 categorías (Equipos / EPC / Costos Blandos / Contingencias) en USD y COP</w:t>
+        <w:br/>
+        <w:t xml:space="preserve">  • Tabla comparativa de 3 escenarios (Optimista / Base / Conservador) con código de color</w:t>
+        <w:br/>
+        <w:t xml:space="preserve">  • OPEX anual desglosado</w:t>
+        <w:br/>
+        <w:t xml:space="preserve">  • Nota metodológica honesta: precisión ±25–35 %, fuentes UPME/IRENA 2026, suficiencia para Etapa 1 de prefactibilidad</w:t>
+        <w:br/>
+        <w:t>Este bloque se activa por defecto si la estimación fue aplicada. Si usas cotización real, desactívalo para que el reporte muestre solo los valores auditables.</w:t>
+      </w:r>
+    </w:p>
+    <w:p>
+      <w:pPr/>
+      <w:r/>
+    </w:p>
+    <w:p>
+      <w:pPr/>
+      <w:r>
+        <w:t xml:space="preserve">    B4 — Aviso para proyectos BIPV muy pequeños  (nuevo)</w:t>
+      </w:r>
+    </w:p>
+    <w:p>
+      <w:pPr/>
+      <w:r>
+        <w:rPr>
+          <w:b/>
+        </w:rPr>
+        <w:t>B4 — Aviso para proyectos BIPV muy pequeños  (nuevo)</w:t>
+      </w:r>
+    </w:p>
+    <w:p>
+      <w:pPr/>
+      <w:r>
+        <w:t>Cuando el sistema tiene menos de 20 kWp y el tipo es BIPV fachada / pérgola, aparece un aviso naranja explicando que los costos fijos del modelo (SCADA, permisos RETIE/UPME, conexión a red) pueden superar el 50 % del CAPEX y elevar el USD/Wp muy por encima de los rangos típicos de mercado. Los benchmarks están calibrados para proyectos ≥ 30 kWp. Para proyectos menores se recomienda cotización EPC directa.</w:t>
+      </w:r>
+    </w:p>
+    <w:p>
+      <w:pPr/>
+      <w:r/>
+    </w:p>
+    <w:p>
+      <w:pPr/>
+      <w:r>
+        <w:t>────────────────────────────────────────────────────────────</w:t>
+      </w:r>
+    </w:p>
+    <w:p>
+      <w:pPr>
+        <w:pStyle w:val="Ttulo3"/>
+      </w:pPr>
+      <w:r>
+        <w:t>📐 Rangos de referencia USD/Wp por tipo y escala</w:t>
+      </w:r>
+    </w:p>
+    <w:p>
+      <w:pPr/>
+      <w:r>
+        <w:t>Los costos fijos (SCADA, permisos, conexión a red) tienen un impacto mayor en proyectos pequeños. Los siguientes rangos reflejan el comportamiento real del modelo:</w:t>
+      </w:r>
+    </w:p>
+    <w:p>
+      <w:pPr/>
+      <w:r>
+        <w:t>Tipo de instalación  │  Escala  │  Rango USD/Wp  │  Nota</w:t>
+      </w:r>
+    </w:p>
+    <w:p>
+      <w:pPr/>
+      <w:r>
+        <w:t>Granja FV campo  │  Cualquier tamaño  │  0.70 – 1.20 USD/Wp  │  Costos fijos diluidos en volume</w:t>
+      </w:r>
+    </w:p>
+    <w:p>
+      <w:pPr/>
+      <w:r>
+        <w:t xml:space="preserve">Techo industrial  │  Cualquier tamaño  │  0.85 – 1.60 USD/Wp  │  </w:t>
+      </w:r>
+    </w:p>
+    <w:p>
+      <w:pPr/>
+      <w:r>
+        <w:t>BIPV fachada / pérgola  │  &gt; 200 kWp  │  0.75 – 2.00 USD/Wp  │  Economías de escala importantes</w:t>
+      </w:r>
+    </w:p>
+    <w:p>
+      <w:pPr/>
+      <w:r>
+        <w:t>BIPV fachada / pérgola  │  50 – 200 kWp  │  0.85 – 2.80 USD/Wp  │  Rango medio de mercado</w:t>
+      </w:r>
+    </w:p>
+    <w:p>
+      <w:pPr/>
+      <w:r>
+        <w:t>BIPV fachada / pérgola  │  &lt; 50 kWp  │  1.20 – 4.50+ USD/Wp  │  Costos fijos dominan — ver aviso</w:t>
+      </w:r>
+    </w:p>
+    <w:p>
+      <w:pPr/>
+      <w:r>
+        <w:t>BIPV fachada / pérgola  │  &lt; 20 kWp  │  &gt; 5.00 USD/Wp posible  │  ⚠️ Aviso activo en app — pedir cotización directa</w:t>
+      </w:r>
+    </w:p>
+    <w:p>
+      <w:pPr/>
+      <w:r>
+        <w:t>El comparativo en el panel muestra el indicador "Ref: [Tipo]" con el rango correspondiente al proyecto actual para que el promotor pueda contextualizarlo al instante.</w:t>
+      </w:r>
+    </w:p>
+    <w:p>
+      <w:pPr/>
+      <w:r>
+        <w:t>────────────────────────────────────────────────────────────</w:t>
+      </w:r>
+    </w:p>
+    <w:p>
+      <w:pPr>
+        <w:pStyle w:val="Ttulo3"/>
+      </w:pPr>
+      <w:r>
+        <w:t>❌ Errores frecuentes — Estimación Rápida</w:t>
+      </w:r>
+    </w:p>
+    <w:p>
+      <w:pPr/>
+      <w:r>
+        <w:rPr>
+          <w:b/>
+        </w:rPr>
+        <w:t>"El CAPEX en Financiero no coincide con lo que veo en Estimación Rápida"</w:t>
+      </w:r>
+    </w:p>
+    <w:p>
+      <w:pPr/>
+      <w:r>
+        <w:t>No se presionó el botón ✅ Aplicar. Solo ver la tabla no transfiere los valores a sesión. El banner verde de confirmación es la señal de que el traspaso se completó. Solución: ir a la pestaña 🧮 Estimación Rápida → presionar Aplicar.</w:t>
+      </w:r>
+    </w:p>
+    <w:p>
+      <w:pPr/>
+      <w:r/>
+    </w:p>
+    <w:p>
+      <w:pPr/>
+      <w:r>
+        <w:rPr>
+          <w:b/>
+        </w:rPr>
+        <w:t>"El USD/Wp me parece muy alto para un proyecto pequeño BIPV"</w:t>
+      </w:r>
+    </w:p>
+    <w:p>
+      <w:pPr/>
+      <w:r>
+        <w:t>Para proyectos BIPV &lt; 20 kWp, los costos fijos (SCADA ~USD 9.000, permisos RETIE/UPME ~USD 8.000–15.000, conexión a red ~USD 10.000–20.000) suman ~USD 35.000–45.000 fijos independientemente del tamaño. En un proyecto de 10 kWp eso representa 3.5 – 4.5 USD/Wp solo en costos fijos. La app muestra un aviso naranja en este caso. Solución: para proyectos &lt; 20 kWp BIPV, solicitar cotización EPC directa.</w:t>
+      </w:r>
+    </w:p>
+    <w:p>
+      <w:pPr/>
+      <w:r/>
+    </w:p>
+    <w:p>
+      <w:pPr/>
+      <w:r>
+        <w:rPr>
+          <w:b/>
+        </w:rPr>
+        <w:t>"La zona geográfica auto-detectada es incorrecta"</w:t>
+      </w:r>
+    </w:p>
+    <w:p>
+      <w:pPr/>
+      <w:r>
+        <w:t>La detección usa palabras clave en el nombre de la ciudad. Corregimientos, veredas, zonas industriales con nombres atípicos o ciudades intermedias no siempre se mapean. Solución: cambiar manualmente el selector de zona antes de aplicar.</w:t>
+      </w:r>
+    </w:p>
+    <w:p>
+      <w:pPr/>
+      <w:r/>
+    </w:p>
+    <w:p>
+      <w:pPr/>
+      <w:r>
+        <w:rPr>
+          <w:b/>
+        </w:rPr>
+        <w:t>"Apliqué la estimación pero quiero usar mi cotización real"</w:t>
+      </w:r>
+    </w:p>
+    <w:p>
+      <w:pPr/>
+      <w:r>
+        <w:t>Llena las pestañas de cotización detallada (Perfilería, Mano de Obra, Sistema FV, etc.) con tus valores reales. La cotización real SIEMPRE tiene prioridad sobre la paramétrica — no necesitas borrar la estimación. Cuando hayas terminado la cotización real, presiona 🔄 Limpiar para dejar explícito que ya no usas el estimado.</w:t>
+      </w:r>
+    </w:p>
+    <w:p>
+      <w:pPr/>
+      <w:r/>
+    </w:p>
+    <w:p>
+      <w:pPr/>
+      <w:r>
+        <w:rPr>
+          <w:b/>
+        </w:rPr>
+        <w:t>"El Reporte PDF no muestra la sección de Estimación Rápida"</w:t>
+      </w:r>
+    </w:p>
+    <w:p>
+      <w:pPr/>
+      <w:r>
+        <w:t>Verificar dos condiciones: (1) ¿Se presionó ✅ Aplicar en la pestaña 🧮 Estimación Rápida? (2) ¿Está activado el checkbox "🧮 Incluir Estimación Rápida" en la página 📄 Informe en PDF? El checkbox solo aparece si la estimación está aplicada (est_rapida_aplicada = True en sesión). Si se recargó el navegador, la sesión se pierde y hay que volver a aplicar.</w:t>
+      </w:r>
+    </w:p>
+    <w:p>
+      <w:pPr/>
+      <w:r/>
+    </w:p>
+    <w:p>
+      <w:pPr/>
+      <w:r>
+        <w:rPr>
+          <w:b/>
+        </w:rPr>
+        <w:t>"El banner de auto-actualización no apareció aunque cambié el kWp"</w:t>
+      </w:r>
+    </w:p>
+    <w:p>
+      <w:pPr/>
+      <w:r>
+        <w:t>La auto-actualización solo se dispara si el cambio de kWp supera el 5 %. Cambios menores se ignoran deliberadamente para evitar actualizaciones por errores de entrada. Para forzar una actualización con cualquier cambio: limpiar la estimación y volver a aplicar.</w:t>
+      </w:r>
+    </w:p>
+    <w:p>
+      <w:pPr/>
+      <w:r/>
+    </w:p>
+    <w:p>
+      <w:pPr/>
+      <w:r>
+        <w:t>────────────────────────────────────────────────────────────</w:t>
+      </w:r>
+    </w:p>
+    <w:p>
+      <w:pPr>
+        <w:pStyle w:val="Ttulo3"/>
+      </w:pPr>
+      <w:r>
+        <w:t>📊 Interpretación de indicadores clave</w:t>
+      </w:r>
+    </w:p>
+    <w:p>
+      <w:pPr/>
+      <w:r>
+        <w:rPr>
+          <w:b/>
+        </w:rPr>
+        <w:t>CAPEX Total</w:t>
+      </w:r>
+    </w:p>
+    <w:p>
+      <w:pPr/>
+      <w:r>
+        <w:t xml:space="preserve">  Qué es: Costo total de inversión. Incluye equipos, construcción, ingeniería y contingencias. Precisión ±25–35 % sobre cotización EPC real.</w:t>
+      </w:r>
+    </w:p>
+    <w:p>
+      <w:pPr/>
+      <w:r>
+        <w:t xml:space="preserve">  Nota:   ¿Es suficiente para una decisión? Sí, para Etapa 1 de prefactibilidad.</w:t>
+      </w:r>
+    </w:p>
+    <w:p>
+      <w:pPr/>
+      <w:r/>
+    </w:p>
+    <w:p>
+      <w:pPr/>
+      <w:r>
+        <w:rPr>
+          <w:b/>
+        </w:rPr>
+        <w:t>USD/Wp</w:t>
+      </w:r>
+    </w:p>
+    <w:p>
+      <w:pPr/>
+      <w:r>
+        <w:t xml:space="preserve">  Qué es: Indicador universal de eficiencia de inversión. Los bancos lo comparan contra proyectos similares en la región. Varía significativamente con la escala (ver tabla de rangos).</w:t>
+      </w:r>
+    </w:p>
+    <w:p>
+      <w:pPr/>
+      <w:r>
+        <w:t xml:space="preserve">  Nota:   No comparar proyectos de diferente tamaño usando solo este indicador.</w:t>
+      </w:r>
+    </w:p>
+    <w:p>
+      <w:pPr/>
+      <w:r/>
+    </w:p>
+    <w:p>
+      <w:pPr/>
+      <w:r>
+        <w:rPr>
+          <w:b/>
+        </w:rPr>
+        <w:t>OPEX anual</w:t>
+      </w:r>
+    </w:p>
+    <w:p>
+      <w:pPr/>
+      <w:r>
+        <w:t xml:space="preserve">  Qué es: O&amp;M + limpieza + seguros + monitoreo + fondo de reposición del inversor. No incluye impuestos prediales, costos de financiación ni IVA.</w:t>
+      </w:r>
+    </w:p>
+    <w:p>
+      <w:pPr/>
+      <w:r>
+        <w:t xml:space="preserve">  Nota:   Referencia sana: 1.0 – 2.5 % del CAPEX por año.</w:t>
+      </w:r>
+    </w:p>
+    <w:p>
+      <w:pPr/>
+      <w:r/>
+    </w:p>
+    <w:p>
+      <w:pPr/>
+      <w:r>
+        <w:rPr>
+          <w:b/>
+        </w:rPr>
+        <w:t>Fracción de equipos (Ley 1715)</w:t>
+      </w:r>
+    </w:p>
+    <w:p>
+      <w:pPr/>
+      <w:r>
+        <w:t xml:space="preserve">  Qué es: Base para calcular: Art. 11 (deducción renta 50 % del CAPEX equipos), Art. 12 (exclusión IVA en compra de equipos), Art. 14 (depreciación acelerada). Solo aplica si el proyecto está registrado ante la UPME.</w:t>
+      </w:r>
+    </w:p>
+    <w:p>
+      <w:pPr/>
+      <w:r>
+        <w:t xml:space="preserve">  Nota:   Si es incorrecta, los beneficios tributarios en Financiero quedan mal calculados.</w:t>
+      </w:r>
+    </w:p>
+    <w:p>
+      <w:pPr/>
+      <w:r/>
+    </w:p>
+    <w:p>
+      <w:pPr/>
+      <w:r>
+        <w:rPr>
+          <w:b/>
+        </w:rPr>
+        <w:t>Escenario Base</w:t>
+      </w:r>
+    </w:p>
+    <w:p>
+      <w:pPr/>
+      <w:r>
+        <w:t xml:space="preserve">  Qué es: Mediana del mercado colombiano julio 2026. Fuentes: UPME, IRENA Renewable Power Generation Costs 2023, CCSE, datos de campo Urabá–Antioquia–Valle.</w:t>
+      </w:r>
+    </w:p>
+    <w:p>
+      <w:pPr/>
+      <w:r>
+        <w:t xml:space="preserve">  Nota:   Los precios de equipos cambian. Actualizar benchmarks semestralmente para proyectos en desarrollo activo.</w:t>
+      </w:r>
+    </w:p>
+    <w:p>
+      <w:pPr/>
+      <w:r/>
+    </w:p>
+    <w:p>
+      <w:pPr/>
+      <w:r>
+        <w:rPr>
+          <w:b/>
+        </w:rPr>
+        <w:t>Factor P90</w:t>
+      </w:r>
+    </w:p>
+    <w:p>
+      <w:pPr/>
+      <w:r>
+        <w:t xml:space="preserve">  Qué es: Reducción aplicada a la producción E_ac (P50) para obtener el escenario conservador exigido por bancos: "hay 90 % de probabilidad de superar esta producción". Calculado automáticamente según zona y correcciones activas (Motor Óptico, Bypass Diodes).</w:t>
+      </w:r>
+    </w:p>
+    <w:p>
+      <w:pPr/>
+      <w:r>
+        <w:t xml:space="preserve">  Nota:   Bogotá sin correcciones: ~9.5 %. Barranquilla con Motor Óptico + Bypass: ~6.8 %. A mayor precisión de simulación, menor factor P90, mejor flujo de caja proyectado.</w:t>
+      </w:r>
+    </w:p>
+    <w:p>
+      <w:pPr/>
+      <w:r/>
+    </w:p>
+    <w:p>
+      <w:pPr/>
+      <w:r>
+        <w:t>────────────────────────────────────────────────────────────</w:t>
+      </w:r>
+    </w:p>
+    <w:p>
+      <w:pPr>
+        <w:pStyle w:val="Ttulo3"/>
+      </w:pPr>
+      <w:r>
+        <w:t>✅ / ⛔ Cuándo usar la Estimación Rápida</w:t>
+      </w:r>
+    </w:p>
+    <w:p>
+      <w:pPr/>
+      <w:r>
+        <w:t>✅ Usar para:</w:t>
+      </w:r>
+    </w:p>
+    <w:p>
+      <w:pPr>
+        <w:pStyle w:val="Listaconvietas"/>
+      </w:pPr>
+      <w:r>
+        <w:t>Prefactibilidad Etapa 1: decidir si el proyecto amerita invertir en ingeniería detallada.</w:t>
+      </w:r>
+    </w:p>
+    <w:p>
+      <w:pPr>
+        <w:pStyle w:val="Listaconvietas"/>
+      </w:pPr>
+      <w:r>
+        <w:t>Tamizaje de oportunidades: comparar 5–10 proyectos potenciales en un día.</w:t>
+      </w:r>
+    </w:p>
+    <w:p>
+      <w:pPr>
+        <w:pStyle w:val="Listaconvietas"/>
+      </w:pPr>
+      <w:r>
+        <w:t>Reunión inicial con el cliente: mostrar rango de inversión con Ley 1715 ya incluida, sin esperar cotizaciones.</w:t>
+      </w:r>
+    </w:p>
+    <w:p>
+      <w:pPr>
+        <w:pStyle w:val="Listaconvietas"/>
+      </w:pPr>
+      <w:r>
+        <w:t>Sensibilidad por escenario: comparar optimista vs. conservador antes de comprometer recursos.</w:t>
+      </w:r>
+    </w:p>
+    <w:p>
+      <w:pPr>
+        <w:pStyle w:val="Listaconvietas"/>
+      </w:pPr>
+      <w:r>
+        <w:t>Alimentar Financiero: cuando no se dispone aún de cotización EPC formal, los valores paramétricos permiten calcular TIR/VPN orientativos.</w:t>
+      </w:r>
+    </w:p>
+    <w:p>
+      <w:pPr/>
+      <w:r>
+        <w:t>⛔ No usar para:</w:t>
+      </w:r>
+    </w:p>
+    <w:p>
+      <w:pPr>
+        <w:pStyle w:val="Listaconvietas"/>
+      </w:pPr>
+      <w:r>
+        <w:t>Bancabilidad formal: bancos y fondos exigen cotización EPC firmada con vigencia de precios. La precisión ±25–35 % no es aceptable para estructurar un crédito.</w:t>
+      </w:r>
+    </w:p>
+    <w:p>
+      <w:pPr>
+        <w:pStyle w:val="Listaconvietas"/>
+      </w:pPr>
+      <w:r>
+        <w:t>Licitaciones o contratos: no tiene valor legal como oferta económica.</w:t>
+      </w:r>
+    </w:p>
+    <w:p>
+      <w:pPr>
+        <w:pStyle w:val="Listaconvietas"/>
+      </w:pPr>
+      <w:r>
+        <w:t>Proyectos &lt; 20 kWp BIPV: los costos fijos distorsionan el USD/Wp — solicitar cotización directa.</w:t>
+      </w:r>
+    </w:p>
+    <w:p>
+      <w:pPr>
+        <w:pStyle w:val="Listaconvietas"/>
+      </w:pPr>
+      <w:r>
+        <w:t>Zonas muy remotas con logística atípica: helicóptero, barcaza, mula. El factor de zona Colombia no cubre estos casos extremos.</w:t>
+      </w:r>
+    </w:p>
+    <w:p>
+      <w:pPr/>
+      <w:r>
+        <w:t>────────────────────────────────────────────────────────────</w:t>
+      </w:r>
+    </w:p>
+    <w:p>
       <w:pPr>
         <w:pStyle w:val="Ttulo2"/>
       </w:pPr>
@@ -6874,6 +7550,14 @@
           <w:sz w:val="24"/>
         </w:rPr>
         <w:t>Sección 5b — Costos del Presupuesto (nueva, #8)</w:t>
+      </w:r>
+    </w:p>
+    <w:p>
+      <w:pPr/>
+      <w:r>
+        <w:t>5c — Estimación Rápida Paramétrica  (nuevo agosto 2026)</w:t>
+        <w:br/>
+        <w:t>Además de la sección 5b (Costos del Presupuesto detallado), existe ahora la sección "🧮 Estimación Rápida — Fundamentación del Presupuesto", activada con su propio checkbox. Se activa automáticamente si la estimación fue aplicada. Incluye: desglose de 4 categorías CAPEX en USD/COP, tabla comparativa 3 escenarios con código de color, OPEX anual, y nota metodológica con fuentes y declaración de precisión ±25–35 %. Si se usa cotización real completa en las pestañas de Presupuesto, se recomienda desactivar este checkbox para que el reporte muestre solo los valores auditables.</w:t>
       </w:r>
     </w:p>
     <w:p>

</xml_diff>